<commit_message>
github: Sửa nội dung file  A1
</commit_message>
<xml_diff>
--- a/A/Github01_A1.docx
+++ b/A/Github01_A1.docx
@@ -1,6 +1,6 @@
 
 <file path=word/document.xml><?xml version="1.0" encoding="utf-8"?>
-<w:document xmlns:wpc="http://schemas.microsoft.com/office/word/2010/wordprocessingCanvas" xmlns:cx="http://schemas.microsoft.com/office/drawing/2014/chartex" xmlns:cx1="http://schemas.microsoft.com/office/drawing/2015/9/8/chartex" xmlns:cx2="http://schemas.microsoft.com/office/drawing/2015/10/21/chartex" xmlns:cx3="http://schemas.microsoft.com/office/drawing/2016/5/9/chartex" xmlns:cx4="http://schemas.microsoft.com/office/drawing/2016/5/10/chartex" xmlns:cx5="http://schemas.microsoft.com/office/drawing/2016/5/11/chartex" xmlns:cx6="http://schemas.microsoft.com/office/drawing/2016/5/12/chartex" xmlns:cx7="http://schemas.microsoft.com/office/drawing/2016/5/13/chartex" xmlns:cx8="http://schemas.microsoft.com/office/drawing/2016/5/14/chartex" xmlns:mc="http://schemas.openxmlformats.org/markup-compatibility/2006" xmlns:aink="http://schemas.microsoft.com/office/drawing/2016/ink" xmlns:am3d="http://schemas.microsoft.com/office/drawing/2017/model3d" xmlns:o="urn:schemas-microsoft-com:office:office" xmlns:oel="http://schemas.microsoft.com/office/2019/extlst" xmlns:r="http://schemas.openxmlformats.org/officeDocument/2006/relationships" xmlns:m="http://schemas.openxmlformats.org/officeDocument/2006/math" xmlns:v="urn:schemas-microsoft-com:vml" xmlns:wp14="http://schemas.microsoft.com/office/word/2010/wordprocessingDrawing" xmlns:wp="http://schemas.openxmlformats.org/drawingml/2006/wordprocessingDrawing" xmlns:w10="urn:schemas-microsoft-com:office:word" xmlns:w="http://schemas.openxmlformats.org/wordprocessingml/2006/main" xmlns:w14="http://schemas.microsoft.com/office/word/2010/wordml" xmlns:w15="http://schemas.microsoft.com/office/word/2012/wordml" xmlns:w16cex="http://schemas.microsoft.com/office/word/2018/wordml/cex" xmlns:w16cid="http://schemas.microsoft.com/office/word/2016/wordml/cid" xmlns:w16="http://schemas.microsoft.com/office/word/2018/wordml" xmlns:w16du="http://schemas.microsoft.com/office/word/2023/wordml/word16du" xmlns:w16sdtdh="http://schemas.microsoft.com/office/word/2020/wordml/sdtdatahash" xmlns:w16se="http://schemas.microsoft.com/office/word/2015/wordml/symex" xmlns:wpg="http://schemas.microsoft.com/office/word/2010/wordprocessingGroup" xmlns:wpi="http://schemas.microsoft.com/office/word/2010/wordprocessingInk" xmlns:wne="http://schemas.microsoft.com/office/word/2006/wordml" xmlns:wps="http://schemas.microsoft.com/office/word/2010/wordprocessingShape" mc:Ignorable="w14 w15 w16se w16cid w16 w16cex w16sdtdh w16du wp14">
+<w:document xmlns:wpc="http://schemas.microsoft.com/office/word/2010/wordprocessingCanvas" xmlns:cx="http://schemas.microsoft.com/office/drawing/2014/chartex" xmlns:cx1="http://schemas.microsoft.com/office/drawing/2015/9/8/chartex" xmlns:cx2="http://schemas.microsoft.com/office/drawing/2015/10/21/chartex" xmlns:cx3="http://schemas.microsoft.com/office/drawing/2016/5/9/chartex" xmlns:cx4="http://schemas.microsoft.com/office/drawing/2016/5/10/chartex" xmlns:cx5="http://schemas.microsoft.com/office/drawing/2016/5/11/chartex" xmlns:cx6="http://schemas.microsoft.com/office/drawing/2016/5/12/chartex" xmlns:cx7="http://schemas.microsoft.com/office/drawing/2016/5/13/chartex" xmlns:cx8="http://schemas.microsoft.com/office/drawing/2016/5/14/chartex" xmlns:mc="http://schemas.openxmlformats.org/markup-compatibility/2006" xmlns:aink="http://schemas.microsoft.com/office/drawing/2016/ink" xmlns:am3d="http://schemas.microsoft.com/office/drawing/2017/model3d" xmlns:o="urn:schemas-microsoft-com:office:office" xmlns:oel="http://schemas.microsoft.com/office/2019/extlst" xmlns:r="http://schemas.openxmlformats.org/officeDocument/2006/relationships" xmlns:m="http://schemas.openxmlformats.org/officeDocument/2006/math" xmlns:v="urn:schemas-microsoft-com:vml" xmlns:wp14="http://schemas.microsoft.com/office/word/2010/wordprocessingDrawing" xmlns:wp="http://schemas.openxmlformats.org/drawingml/2006/wordprocessingDrawing" xmlns:w10="urn:schemas-microsoft-com:office:word" xmlns:w="http://schemas.openxmlformats.org/wordprocessingml/2006/main" xmlns:w14="http://schemas.microsoft.com/office/word/2010/wordml" xmlns:w15="http://schemas.microsoft.com/office/word/2012/wordml" xmlns:w16cex="http://schemas.microsoft.com/office/word/2018/wordml/cex" xmlns:w16cid="http://schemas.microsoft.com/office/word/2016/wordml/cid" xmlns:w16="http://schemas.microsoft.com/office/word/2018/wordml" xmlns:w16du="http://schemas.microsoft.com/office/word/2023/wordml/word16du" xmlns:w16sdtdh="http://schemas.microsoft.com/office/word/2020/wordml/sdtdatahash" xmlns:w16sdtfl="http://schemas.microsoft.com/office/word/2024/wordml/sdtformatlock" xmlns:w16se="http://schemas.microsoft.com/office/word/2015/wordml/symex" xmlns:wpg="http://schemas.microsoft.com/office/word/2010/wordprocessingGroup" xmlns:wpi="http://schemas.microsoft.com/office/word/2010/wordprocessingInk" xmlns:wne="http://schemas.microsoft.com/office/word/2006/wordml" xmlns:wps="http://schemas.microsoft.com/office/word/2010/wordprocessingShape" mc:Ignorable="w14 w15 w16se w16cid w16 w16cex w16sdtdh w16sdtfl w16du wp14">
   <w:body>
     <w:p>
       <w:pPr>
@@ -16,6 +16,9 @@
       <w:r>
         <w:t>_0001</w:t>
       </w:r>
+      <w:r>
+        <w:t>_ sưa nội dung github01</w:t>
+      </w:r>
     </w:p>
     <w:p>
       <w:r>
@@ -23,7 +26,6 @@
       </w:r>
     </w:p>
     <w:p>
-      <w:proofErr w:type="gramStart"/>
       <w:r>
         <w:t>Ref:</w:t>
       </w:r>
@@ -32,39 +34,62 @@
           <w:kern w:val="0"/>
           <w14:ligatures w14:val="none"/>
         </w:rPr>
-        <w:t>REQ</w:t>
-      </w:r>
-      <w:proofErr w:type="gramEnd"/>
+        <w:t>REQ_0001</w:t>
+      </w:r>
+    </w:p>
+    <w:p/>
+    <w:p/>
+    <w:bookmarkEnd w:id="0"/>
+    <w:p>
+      <w:pPr>
+        <w:pStyle w:val="Heading2"/>
+      </w:pPr>
+      <w:r>
+        <w:t>BBBBBB</w:t>
+      </w:r>
+      <w:r>
+        <w:t xml:space="preserve"> ABC</w:t>
+      </w:r>
+      <w:r>
+        <w:t>_000</w:t>
+      </w:r>
+      <w:r>
+        <w:t>2</w:t>
+      </w:r>
+    </w:p>
+    <w:p>
+      <w:r>
+        <w:t>Ref:</w:t>
+      </w:r>
       <w:r>
         <w:rPr>
           <w:kern w:val="0"/>
           <w14:ligatures w14:val="none"/>
         </w:rPr>
-        <w:t>_0001</w:t>
+        <w:t>REQ_0002</w:t>
+      </w:r>
+    </w:p>
+    <w:p>
+      <w:r>
+        <w:t>2222</w:t>
       </w:r>
     </w:p>
     <w:p/>
-    <w:p/>
-    <w:bookmarkEnd w:id="0"/>
-    <w:p>
-      <w:pPr>
-        <w:pStyle w:val="Heading2"/>
-      </w:pPr>
-      <w:r>
-        <w:t>BBBBBB</w:t>
-      </w:r>
-      <w:r>
-        <w:t xml:space="preserve"> ABC</w:t>
+    <w:p>
+      <w:pPr>
+        <w:pStyle w:val="Heading1"/>
+      </w:pPr>
+      <w:r>
+        <w:t>CCCCC ABC</w:t>
       </w:r>
       <w:r>
         <w:t>_000</w:t>
       </w:r>
       <w:r>
-        <w:t>2</w:t>
-      </w:r>
-    </w:p>
-    <w:p>
-      <w:proofErr w:type="gramStart"/>
+        <w:t>3</w:t>
+      </w:r>
+    </w:p>
+    <w:p>
       <w:r>
         <w:t>Ref:</w:t>
       </w:r>
@@ -73,56 +98,7 @@
           <w:kern w:val="0"/>
           <w14:ligatures w14:val="none"/>
         </w:rPr>
-        <w:t>REQ</w:t>
-      </w:r>
-      <w:proofErr w:type="gramEnd"/>
-      <w:r>
-        <w:rPr>
-          <w:kern w:val="0"/>
-          <w14:ligatures w14:val="none"/>
-        </w:rPr>
-        <w:t>_0002</w:t>
-      </w:r>
-    </w:p>
-    <w:p>
-      <w:r>
-        <w:t>2222</w:t>
-      </w:r>
-    </w:p>
-    <w:p/>
-    <w:p>
-      <w:pPr>
-        <w:pStyle w:val="Heading1"/>
-      </w:pPr>
-      <w:r>
-        <w:t>CCCCC ABC</w:t>
-      </w:r>
-      <w:r>
-        <w:t>_000</w:t>
-      </w:r>
-      <w:r>
-        <w:t>3</w:t>
-      </w:r>
-    </w:p>
-    <w:p>
-      <w:proofErr w:type="gramStart"/>
-      <w:r>
-        <w:t>Ref:</w:t>
-      </w:r>
-      <w:r>
-        <w:rPr>
-          <w:kern w:val="0"/>
-          <w14:ligatures w14:val="none"/>
-        </w:rPr>
-        <w:t>REQ</w:t>
-      </w:r>
-      <w:proofErr w:type="gramEnd"/>
-      <w:r>
-        <w:rPr>
-          <w:kern w:val="0"/>
-          <w14:ligatures w14:val="none"/>
-        </w:rPr>
-        <w:t>_0002</w:t>
+        <w:t>REQ_0002</w:t>
       </w:r>
     </w:p>
     <w:p/>
@@ -138,13 +114,8 @@
     </w:p>
     <w:p>
       <w:r>
-        <w:t xml:space="preserve"> Test </w:t>
-      </w:r>
-      <w:proofErr w:type="gramStart"/>
-      <w:r>
-        <w:t>13rere</w:t>
-      </w:r>
-      <w:proofErr w:type="gramEnd"/>
+        <w:t xml:space="preserve"> Test 13rere</w:t>
+      </w:r>
     </w:p>
     <w:p/>
     <w:p>
@@ -214,7 +185,7 @@
 </file>
 
 <file path=word/numbering.xml><?xml version="1.0" encoding="utf-8"?>
-<w:numbering xmlns:wpc="http://schemas.microsoft.com/office/word/2010/wordprocessingCanvas" xmlns:cx="http://schemas.microsoft.com/office/drawing/2014/chartex" xmlns:cx1="http://schemas.microsoft.com/office/drawing/2015/9/8/chartex" xmlns:cx2="http://schemas.microsoft.com/office/drawing/2015/10/21/chartex" xmlns:cx3="http://schemas.microsoft.com/office/drawing/2016/5/9/chartex" xmlns:cx4="http://schemas.microsoft.com/office/drawing/2016/5/10/chartex" xmlns:cx5="http://schemas.microsoft.com/office/drawing/2016/5/11/chartex" xmlns:cx6="http://schemas.microsoft.com/office/drawing/2016/5/12/chartex" xmlns:cx7="http://schemas.microsoft.com/office/drawing/2016/5/13/chartex" xmlns:cx8="http://schemas.microsoft.com/office/drawing/2016/5/14/chartex" xmlns:mc="http://schemas.openxmlformats.org/markup-compatibility/2006" xmlns:aink="http://schemas.microsoft.com/office/drawing/2016/ink" xmlns:am3d="http://schemas.microsoft.com/office/drawing/2017/model3d" xmlns:o="urn:schemas-microsoft-com:office:office" xmlns:oel="http://schemas.microsoft.com/office/2019/extlst" xmlns:r="http://schemas.openxmlformats.org/officeDocument/2006/relationships" xmlns:m="http://schemas.openxmlformats.org/officeDocument/2006/math" xmlns:v="urn:schemas-microsoft-com:vml" xmlns:wp14="http://schemas.microsoft.com/office/word/2010/wordprocessingDrawing" xmlns:wp="http://schemas.openxmlformats.org/drawingml/2006/wordprocessingDrawing" xmlns:w10="urn:schemas-microsoft-com:office:word" xmlns:w="http://schemas.openxmlformats.org/wordprocessingml/2006/main" xmlns:w14="http://schemas.microsoft.com/office/word/2010/wordml" xmlns:w15="http://schemas.microsoft.com/office/word/2012/wordml" xmlns:w16cex="http://schemas.microsoft.com/office/word/2018/wordml/cex" xmlns:w16cid="http://schemas.microsoft.com/office/word/2016/wordml/cid" xmlns:w16="http://schemas.microsoft.com/office/word/2018/wordml" xmlns:w16du="http://schemas.microsoft.com/office/word/2023/wordml/word16du" xmlns:w16sdtdh="http://schemas.microsoft.com/office/word/2020/wordml/sdtdatahash" xmlns:w16se="http://schemas.microsoft.com/office/word/2015/wordml/symex" xmlns:wpg="http://schemas.microsoft.com/office/word/2010/wordprocessingGroup" xmlns:wpi="http://schemas.microsoft.com/office/word/2010/wordprocessingInk" xmlns:wne="http://schemas.microsoft.com/office/word/2006/wordml" xmlns:wps="http://schemas.microsoft.com/office/word/2010/wordprocessingShape" mc:Ignorable="w14 w15 w16se w16cid w16 w16cex w16sdtdh w16du wp14">
+<w:numbering xmlns:wpc="http://schemas.microsoft.com/office/word/2010/wordprocessingCanvas" xmlns:cx="http://schemas.microsoft.com/office/drawing/2014/chartex" xmlns:cx1="http://schemas.microsoft.com/office/drawing/2015/9/8/chartex" xmlns:cx2="http://schemas.microsoft.com/office/drawing/2015/10/21/chartex" xmlns:cx3="http://schemas.microsoft.com/office/drawing/2016/5/9/chartex" xmlns:cx4="http://schemas.microsoft.com/office/drawing/2016/5/10/chartex" xmlns:cx5="http://schemas.microsoft.com/office/drawing/2016/5/11/chartex" xmlns:cx6="http://schemas.microsoft.com/office/drawing/2016/5/12/chartex" xmlns:cx7="http://schemas.microsoft.com/office/drawing/2016/5/13/chartex" xmlns:cx8="http://schemas.microsoft.com/office/drawing/2016/5/14/chartex" xmlns:mc="http://schemas.openxmlformats.org/markup-compatibility/2006" xmlns:aink="http://schemas.microsoft.com/office/drawing/2016/ink" xmlns:am3d="http://schemas.microsoft.com/office/drawing/2017/model3d" xmlns:o="urn:schemas-microsoft-com:office:office" xmlns:oel="http://schemas.microsoft.com/office/2019/extlst" xmlns:r="http://schemas.openxmlformats.org/officeDocument/2006/relationships" xmlns:m="http://schemas.openxmlformats.org/officeDocument/2006/math" xmlns:v="urn:schemas-microsoft-com:vml" xmlns:wp14="http://schemas.microsoft.com/office/word/2010/wordprocessingDrawing" xmlns:wp="http://schemas.openxmlformats.org/drawingml/2006/wordprocessingDrawing" xmlns:w10="urn:schemas-microsoft-com:office:word" xmlns:w="http://schemas.openxmlformats.org/wordprocessingml/2006/main" xmlns:w14="http://schemas.microsoft.com/office/word/2010/wordml" xmlns:w15="http://schemas.microsoft.com/office/word/2012/wordml" xmlns:w16cex="http://schemas.microsoft.com/office/word/2018/wordml/cex" xmlns:w16cid="http://schemas.microsoft.com/office/word/2016/wordml/cid" xmlns:w16="http://schemas.microsoft.com/office/word/2018/wordml" xmlns:w16du="http://schemas.microsoft.com/office/word/2023/wordml/word16du" xmlns:w16sdtdh="http://schemas.microsoft.com/office/word/2020/wordml/sdtdatahash" xmlns:w16sdtfl="http://schemas.microsoft.com/office/word/2024/wordml/sdtformatlock" xmlns:w16se="http://schemas.microsoft.com/office/word/2015/wordml/symex" xmlns:wpg="http://schemas.microsoft.com/office/word/2010/wordprocessingGroup" xmlns:wpi="http://schemas.microsoft.com/office/word/2010/wordprocessingInk" xmlns:wne="http://schemas.microsoft.com/office/word/2006/wordml" xmlns:wps="http://schemas.microsoft.com/office/word/2010/wordprocessingShape" mc:Ignorable="w14 w15 w16se w16cid w16 w16cex w16sdtdh w16sdtfl w16du wp14">
   <w:abstractNum w:abstractNumId="0" w15:restartNumberingAfterBreak="0">
     <w:nsid w:val="4A56013B"/>
     <w:multiLevelType w:val="multilevel"/>
@@ -335,7 +306,7 @@
 </file>
 
 <file path=word/styles.xml><?xml version="1.0" encoding="utf-8"?>
-<w:styles xmlns:mc="http://schemas.openxmlformats.org/markup-compatibility/2006" xmlns:r="http://schemas.openxmlformats.org/officeDocument/2006/relationships" xmlns:w="http://schemas.openxmlformats.org/wordprocessingml/2006/main" xmlns:w14="http://schemas.microsoft.com/office/word/2010/wordml" xmlns:w15="http://schemas.microsoft.com/office/word/2012/wordml" xmlns:w16cex="http://schemas.microsoft.com/office/word/2018/wordml/cex" xmlns:w16cid="http://schemas.microsoft.com/office/word/2016/wordml/cid" xmlns:w16="http://schemas.microsoft.com/office/word/2018/wordml" xmlns:w16du="http://schemas.microsoft.com/office/word/2023/wordml/word16du" xmlns:w16sdtdh="http://schemas.microsoft.com/office/word/2020/wordml/sdtdatahash" xmlns:w16se="http://schemas.microsoft.com/office/word/2015/wordml/symex" mc:Ignorable="w14 w15 w16se w16cid w16 w16cex w16sdtdh w16du">
+<w:styles xmlns:mc="http://schemas.openxmlformats.org/markup-compatibility/2006" xmlns:r="http://schemas.openxmlformats.org/officeDocument/2006/relationships" xmlns:w="http://schemas.openxmlformats.org/wordprocessingml/2006/main" xmlns:w14="http://schemas.microsoft.com/office/word/2010/wordml" xmlns:w15="http://schemas.microsoft.com/office/word/2012/wordml" xmlns:w16cex="http://schemas.microsoft.com/office/word/2018/wordml/cex" xmlns:w16cid="http://schemas.microsoft.com/office/word/2016/wordml/cid" xmlns:w16="http://schemas.microsoft.com/office/word/2018/wordml" xmlns:w16du="http://schemas.microsoft.com/office/word/2023/wordml/word16du" xmlns:w16sdtdh="http://schemas.microsoft.com/office/word/2020/wordml/sdtdatahash" xmlns:w16sdtfl="http://schemas.microsoft.com/office/word/2024/wordml/sdtformatlock" xmlns:w16se="http://schemas.microsoft.com/office/word/2015/wordml/symex" mc:Ignorable="w14 w15 w16se w16cid w16 w16cex w16sdtdh w16sdtfl w16du">
   <w:docDefaults>
     <w:rPrDefault>
       <w:rPr>

</xml_diff>

<commit_message>
github: sửa nội dung file Github01_A1.docx trên github lần 1
</commit_message>
<xml_diff>
--- a/A/Github01_A1.docx
+++ b/A/Github01_A1.docx
@@ -17,7 +17,58 @@
         <w:t>_0001</w:t>
       </w:r>
       <w:r>
-        <w:t>_ sưa nội dung github01</w:t>
+        <w:t xml:space="preserve">_ </w:t>
+      </w:r>
+      <w:proofErr w:type="spellStart"/>
+      <w:r>
+        <w:t>sưa</w:t>
+      </w:r>
+      <w:proofErr w:type="spellEnd"/>
+      <w:r>
+        <w:t xml:space="preserve"> </w:t>
+      </w:r>
+      <w:proofErr w:type="spellStart"/>
+      <w:r>
+        <w:t>nội</w:t>
+      </w:r>
+      <w:proofErr w:type="spellEnd"/>
+      <w:r>
+        <w:t xml:space="preserve"> dung github01</w:t>
+      </w:r>
+    </w:p>
+    <w:p>
+      <w:pPr>
+        <w:rPr>
+          <w:color w:val="EE0000"/>
+        </w:rPr>
+      </w:pPr>
+      <w:proofErr w:type="spellStart"/>
+      <w:r>
+        <w:rPr>
+          <w:color w:val="EE0000"/>
+        </w:rPr>
+        <w:t>Sửa</w:t>
+      </w:r>
+      <w:proofErr w:type="spellEnd"/>
+      <w:r>
+        <w:rPr>
+          <w:color w:val="EE0000"/>
+        </w:rPr>
+        <w:t xml:space="preserve"> </w:t>
+      </w:r>
+      <w:proofErr w:type="spellStart"/>
+      <w:r>
+        <w:rPr>
+          <w:color w:val="EE0000"/>
+        </w:rPr>
+        <w:t>trên</w:t>
+      </w:r>
+      <w:proofErr w:type="spellEnd"/>
+      <w:r>
+        <w:rPr>
+          <w:color w:val="EE0000"/>
+        </w:rPr>
+        <w:t xml:space="preserve"> github01</w:t>
       </w:r>
     </w:p>
     <w:p>
@@ -26,6 +77,7 @@
       </w:r>
     </w:p>
     <w:p>
+      <w:proofErr w:type="gramStart"/>
       <w:r>
         <w:t>Ref:</w:t>
       </w:r>
@@ -34,62 +86,39 @@
           <w:kern w:val="0"/>
           <w14:ligatures w14:val="none"/>
         </w:rPr>
-        <w:t>REQ_0001</w:t>
-      </w:r>
-    </w:p>
-    <w:p/>
-    <w:p/>
-    <w:bookmarkEnd w:id="0"/>
-    <w:p>
-      <w:pPr>
-        <w:pStyle w:val="Heading2"/>
-      </w:pPr>
-      <w:r>
-        <w:t>BBBBBB</w:t>
-      </w:r>
-      <w:r>
-        <w:t xml:space="preserve"> ABC</w:t>
-      </w:r>
-      <w:r>
-        <w:t>_000</w:t>
-      </w:r>
-      <w:r>
-        <w:t>2</w:t>
-      </w:r>
-    </w:p>
-    <w:p>
-      <w:r>
-        <w:t>Ref:</w:t>
-      </w:r>
+        <w:t>REQ</w:t>
+      </w:r>
+      <w:proofErr w:type="gramEnd"/>
       <w:r>
         <w:rPr>
           <w:kern w:val="0"/>
           <w14:ligatures w14:val="none"/>
         </w:rPr>
-        <w:t>REQ_0002</w:t>
-      </w:r>
-    </w:p>
-    <w:p>
-      <w:r>
-        <w:t>2222</w:t>
+        <w:t>_0001</w:t>
       </w:r>
     </w:p>
     <w:p/>
-    <w:p>
-      <w:pPr>
-        <w:pStyle w:val="Heading1"/>
-      </w:pPr>
-      <w:r>
-        <w:t>CCCCC ABC</w:t>
+    <w:p/>
+    <w:bookmarkEnd w:id="0"/>
+    <w:p>
+      <w:pPr>
+        <w:pStyle w:val="Heading2"/>
+      </w:pPr>
+      <w:r>
+        <w:t>BBBBBB</w:t>
+      </w:r>
+      <w:r>
+        <w:t xml:space="preserve"> ABC</w:t>
       </w:r>
       <w:r>
         <w:t>_000</w:t>
       </w:r>
       <w:r>
-        <w:t>3</w:t>
-      </w:r>
-    </w:p>
-    <w:p>
+        <w:t>2</w:t>
+      </w:r>
+    </w:p>
+    <w:p>
+      <w:proofErr w:type="gramStart"/>
       <w:r>
         <w:t>Ref:</w:t>
       </w:r>
@@ -98,7 +127,56 @@
           <w:kern w:val="0"/>
           <w14:ligatures w14:val="none"/>
         </w:rPr>
-        <w:t>REQ_0002</w:t>
+        <w:t>REQ</w:t>
+      </w:r>
+      <w:proofErr w:type="gramEnd"/>
+      <w:r>
+        <w:rPr>
+          <w:kern w:val="0"/>
+          <w14:ligatures w14:val="none"/>
+        </w:rPr>
+        <w:t>_0002</w:t>
+      </w:r>
+    </w:p>
+    <w:p>
+      <w:r>
+        <w:t>2222</w:t>
+      </w:r>
+    </w:p>
+    <w:p/>
+    <w:p>
+      <w:pPr>
+        <w:pStyle w:val="Heading1"/>
+      </w:pPr>
+      <w:r>
+        <w:t>CCCCC ABC</w:t>
+      </w:r>
+      <w:r>
+        <w:t>_000</w:t>
+      </w:r>
+      <w:r>
+        <w:t>3</w:t>
+      </w:r>
+    </w:p>
+    <w:p>
+      <w:proofErr w:type="gramStart"/>
+      <w:r>
+        <w:t>Ref:</w:t>
+      </w:r>
+      <w:r>
+        <w:rPr>
+          <w:kern w:val="0"/>
+          <w14:ligatures w14:val="none"/>
+        </w:rPr>
+        <w:t>REQ</w:t>
+      </w:r>
+      <w:proofErr w:type="gramEnd"/>
+      <w:r>
+        <w:rPr>
+          <w:kern w:val="0"/>
+          <w14:ligatures w14:val="none"/>
+        </w:rPr>
+        <w:t>_0002</w:t>
       </w:r>
     </w:p>
     <w:p/>
@@ -169,6 +247,7 @@
     <w:p/>
     <w:p>
       <w:r>
+        <w:lastRenderedPageBreak/>
         <w:t xml:space="preserve"> Tesst06</w:t>
       </w:r>
     </w:p>

</xml_diff>

<commit_message>
github: sửa nội dung file  Github01_A1.docx lần 02 trên github
</commit_message>
<xml_diff>
--- a/A/Github01_A1.docx
+++ b/A/Github01_A1.docx
@@ -17,23 +17,7 @@
         <w:t>_0001</w:t>
       </w:r>
       <w:r>
-        <w:t xml:space="preserve">_ </w:t>
-      </w:r>
-      <w:proofErr w:type="spellStart"/>
-      <w:r>
-        <w:t>sưa</w:t>
-      </w:r>
-      <w:proofErr w:type="spellEnd"/>
-      <w:r>
-        <w:t xml:space="preserve"> </w:t>
-      </w:r>
-      <w:proofErr w:type="spellStart"/>
-      <w:r>
-        <w:t>nội</w:t>
-      </w:r>
-      <w:proofErr w:type="spellEnd"/>
-      <w:r>
-        <w:t xml:space="preserve"> dung github01</w:t>
+        <w:t>_ sưa nội dung github01</w:t>
       </w:r>
     </w:p>
     <w:p>
@@ -42,33 +26,24 @@
           <w:color w:val="EE0000"/>
         </w:rPr>
       </w:pPr>
-      <w:proofErr w:type="spellStart"/>
       <w:r>
         <w:rPr>
           <w:color w:val="EE0000"/>
         </w:rPr>
-        <w:t>Sửa</w:t>
-      </w:r>
-      <w:proofErr w:type="spellEnd"/>
-      <w:r>
+        <w:t>Sửa trên github01</w:t>
+      </w:r>
+    </w:p>
+    <w:p>
+      <w:pPr>
         <w:rPr>
           <w:color w:val="EE0000"/>
         </w:rPr>
-        <w:t xml:space="preserve"> </w:t>
-      </w:r>
-      <w:proofErr w:type="spellStart"/>
+      </w:pPr>
       <w:r>
         <w:rPr>
           <w:color w:val="EE0000"/>
         </w:rPr>
-        <w:t>trên</w:t>
-      </w:r>
-      <w:proofErr w:type="spellEnd"/>
-      <w:r>
-        <w:rPr>
-          <w:color w:val="EE0000"/>
-        </w:rPr>
-        <w:t xml:space="preserve"> github01</w:t>
+        <w:t xml:space="preserve"> Sửa nội dung lần02</w:t>
       </w:r>
     </w:p>
     <w:p>
@@ -77,7 +52,6 @@
       </w:r>
     </w:p>
     <w:p>
-      <w:proofErr w:type="gramStart"/>
       <w:r>
         <w:t>Ref:</w:t>
       </w:r>
@@ -86,39 +60,62 @@
           <w:kern w:val="0"/>
           <w14:ligatures w14:val="none"/>
         </w:rPr>
-        <w:t>REQ</w:t>
-      </w:r>
-      <w:proofErr w:type="gramEnd"/>
+        <w:t>REQ_0001</w:t>
+      </w:r>
+    </w:p>
+    <w:p/>
+    <w:p/>
+    <w:bookmarkEnd w:id="0"/>
+    <w:p>
+      <w:pPr>
+        <w:pStyle w:val="Heading2"/>
+      </w:pPr>
+      <w:r>
+        <w:t>BBBBBB</w:t>
+      </w:r>
+      <w:r>
+        <w:t xml:space="preserve"> ABC</w:t>
+      </w:r>
+      <w:r>
+        <w:t>_000</w:t>
+      </w:r>
+      <w:r>
+        <w:t>2</w:t>
+      </w:r>
+    </w:p>
+    <w:p>
+      <w:r>
+        <w:t>Ref:</w:t>
+      </w:r>
       <w:r>
         <w:rPr>
           <w:kern w:val="0"/>
           <w14:ligatures w14:val="none"/>
         </w:rPr>
-        <w:t>_0001</w:t>
+        <w:t>REQ_0002</w:t>
+      </w:r>
+    </w:p>
+    <w:p>
+      <w:r>
+        <w:t>2222</w:t>
       </w:r>
     </w:p>
     <w:p/>
-    <w:p/>
-    <w:bookmarkEnd w:id="0"/>
-    <w:p>
-      <w:pPr>
-        <w:pStyle w:val="Heading2"/>
-      </w:pPr>
-      <w:r>
-        <w:t>BBBBBB</w:t>
-      </w:r>
-      <w:r>
-        <w:t xml:space="preserve"> ABC</w:t>
+    <w:p>
+      <w:pPr>
+        <w:pStyle w:val="Heading1"/>
+      </w:pPr>
+      <w:r>
+        <w:t>CCCCC ABC</w:t>
       </w:r>
       <w:r>
         <w:t>_000</w:t>
       </w:r>
       <w:r>
-        <w:t>2</w:t>
-      </w:r>
-    </w:p>
-    <w:p>
-      <w:proofErr w:type="gramStart"/>
+        <w:t>3</w:t>
+      </w:r>
+    </w:p>
+    <w:p>
       <w:r>
         <w:t>Ref:</w:t>
       </w:r>
@@ -127,56 +124,7 @@
           <w:kern w:val="0"/>
           <w14:ligatures w14:val="none"/>
         </w:rPr>
-        <w:t>REQ</w:t>
-      </w:r>
-      <w:proofErr w:type="gramEnd"/>
-      <w:r>
-        <w:rPr>
-          <w:kern w:val="0"/>
-          <w14:ligatures w14:val="none"/>
-        </w:rPr>
-        <w:t>_0002</w:t>
-      </w:r>
-    </w:p>
-    <w:p>
-      <w:r>
-        <w:t>2222</w:t>
-      </w:r>
-    </w:p>
-    <w:p/>
-    <w:p>
-      <w:pPr>
-        <w:pStyle w:val="Heading1"/>
-      </w:pPr>
-      <w:r>
-        <w:t>CCCCC ABC</w:t>
-      </w:r>
-      <w:r>
-        <w:t>_000</w:t>
-      </w:r>
-      <w:r>
-        <w:t>3</w:t>
-      </w:r>
-    </w:p>
-    <w:p>
-      <w:proofErr w:type="gramStart"/>
-      <w:r>
-        <w:t>Ref:</w:t>
-      </w:r>
-      <w:r>
-        <w:rPr>
-          <w:kern w:val="0"/>
-          <w14:ligatures w14:val="none"/>
-        </w:rPr>
-        <w:t>REQ</w:t>
-      </w:r>
-      <w:proofErr w:type="gramEnd"/>
-      <w:r>
-        <w:rPr>
-          <w:kern w:val="0"/>
-          <w14:ligatures w14:val="none"/>
-        </w:rPr>
-        <w:t>_0002</w:t>
+        <w:t>REQ_0002</w:t>
       </w:r>
     </w:p>
     <w:p/>
@@ -241,13 +189,13 @@
         <w:pStyle w:val="Heading3"/>
       </w:pPr>
       <w:r>
+        <w:lastRenderedPageBreak/>
         <w:t>B.02.01</w:t>
       </w:r>
     </w:p>
     <w:p/>
     <w:p>
       <w:r>
-        <w:lastRenderedPageBreak/>
         <w:t xml:space="preserve"> Tesst06</w:t>
       </w:r>
     </w:p>

</xml_diff>